<commit_message>
feat: 공모전 최종 docs
</commit_message>
<xml_diff>
--- a/introduce.docx
+++ b/introduce.docx
@@ -341,7 +341,7 @@
               <w:rPr>
                 <w:rFonts w:ascii="Malgun Gothic" w:cs="Malgun Gothic" w:eastAsia="Malgun Gothic" w:hAnsi="Malgun Gothic"/>
               </w:rPr>
-              <w:t xml:space="preserve">[GitHub Pages 배포 URL] https://ckcdefense.github.io/DropFall/</w:t>
+              <w:t xml:space="preserve">https://dropfall.bomun.dev/</w:t>
             </w:r>
           </w:p>
         </w:tc>
@@ -393,7 +393,7 @@
               <w:rPr>
                 <w:rFonts w:ascii="Malgun Gothic" w:cs="Malgun Gothic" w:eastAsia="Malgun Gothic" w:hAnsi="Malgun Gothic"/>
               </w:rPr>
-              <w:t xml:space="preserve">[YouTube URL]</w:t>
+              <w:t xml:space="preserve">https://youtu.be/xAgh99q5S-8</w:t>
             </w:r>
           </w:p>
         </w:tc>
@@ -3998,20 +3998,11 @@
         </w:numPr>
         <w:spacing w:after="80"/>
       </w:pPr>
-      <w:hyperlink w:history="1" r:id="rIdzojyfpznrwgdfpiaasvtu">
-        <w:r>
-          <w:rPr>
-            <w:rStyle w:val="Hyperlink"/>
-            <w:rFonts w:ascii="Malgun Gothic" w:cs="Malgun Gothic" w:eastAsia="Malgun Gothic" w:hAnsi="Malgun Gothic"/>
-          </w:rPr>
-          <w:t xml:space="preserve">[GitHub Pages 배포 URL</w:t>
-        </w:r>
-      </w:hyperlink>
-      <w:r>
-        <w:rPr>
-          <w:rFonts w:ascii="Malgun Gothic" w:cs="Malgun Gothic" w:eastAsia="Malgun Gothic" w:hAnsi="Malgun Gothic"/>
-        </w:rPr>
-        <w:t xml:space="preserve">]</w:t>
+      <w:r>
+        <w:rPr>
+          <w:rFonts w:ascii="Malgun Gothic" w:cs="Malgun Gothic" w:eastAsia="Malgun Gothic" w:hAnsi="Malgun Gothic"/>
+        </w:rPr>
+        <w:t xml:space="preserve">https://dropfall.bomun.dev/</w:t>
       </w:r>
     </w:p>
     <w:p>
@@ -4178,7 +4169,7 @@
         <w:rPr>
           <w:rFonts w:ascii="Malgun Gothic" w:cs="Malgun Gothic" w:eastAsia="Malgun Gothic" w:hAnsi="Malgun Gothic"/>
         </w:rPr>
-        <w:t xml:space="preserve">YouTube 링크: [YouTube URL]</w:t>
+        <w:t xml:space="preserve">YouTube 링크: https://youtu.be/xAgh99q5S-8</w:t>
       </w:r>
     </w:p>
     <w:p>
@@ -4194,7 +4185,7 @@
         <w:rPr>
           <w:rFonts w:ascii="Malgun Gothic" w:cs="Malgun Gothic" w:eastAsia="Malgun Gothic" w:hAnsi="Malgun Gothic"/>
         </w:rPr>
-        <w:t xml:space="preserve">영상 길이: [예: 약 45초]</w:t>
+        <w:t xml:space="preserve">영상 길이: 약 57초</w:t>
       </w:r>
     </w:p>
     <w:p>

</xml_diff>